<commit_message>
Rewrite PROPOSAL_OUTLINE.docx following professional grant writing standards
- Removed markdown/XML documentation files
- Rewrote PROPOSAL_OUTLINE.docx with detailed technical writing
- Professional structure following AFRI proposal standards:
  * Detailed problem statement with specific data (87M acres, 0B value, 10-30% losses)
  * Clear knowledge gaps specific to soybean
  * Innovation framed as integrated field-modeling approach
  * Rationale grounded in soybean physiology
  * Comparison to successful deficit irrigation in other crops
  * 4 specific research gaps addressed
  * Detailed methodology for first 2 objectives

Next: Complete remaining objectives (3-6) and expected outcomes
</commit_message>
<xml_diff>
--- a/proposal/PROPOSAL_OUTLINE.docx
+++ b/proposal/PROPOSAL_OUTLINE.docx
@@ -12,7 +12,7 @@
           <w:b/>
           <w:sz w:val="32"/>
         </w:rPr>
-        <w:t>USDA-NIFA AFRI Proposal</w:t>
+        <w:t>USDA NIFA AFRI Proposal</w:t>
       </w:r>
     </w:p>
     <w:p>
@@ -24,14 +24,10 @@
         <w:rPr>
           <w:sz w:val="26"/>
         </w:rPr>
-        <w:t>Productivity and Sustainability of Soybean Deficit Irrigation in the US</w:t>
+        <w:t>Productivity and Sustainability of Soybean Deficit Irrigation in the United States</w:t>
       </w:r>
     </w:p>
-    <w:p>
-      <w:r>
-        <w:t>________________________________________________________________________________</w:t>
-      </w:r>
-    </w:p>
+    <w:p/>
     <w:p>
       <w:pPr>
         <w:pStyle w:val="Heading1"/>
@@ -45,12 +41,17 @@
         <w:pStyle w:val="Heading2"/>
       </w:pPr>
       <w:r>
-        <w:t>A. Problem Statement and Research Need</w:t>
+        <w:t>A. Problem Statement</w:t>
       </w:r>
     </w:p>
     <w:p>
       <w:r>
-        <w:t>Soybean production (87 million US acres, $50B annual value) faces critical challenge: water scarcity and climate variability. Only ~15% of US soybean acreage is irrigated. Drought impacts (2012-2023): 10-30% yield loss. Climate projections: increased water stress intensity.</w:t>
+        <w:t>Soybean (Glycine max) is a cornerstone crop of United States agriculture, occupying over 87 million acres annually with a production value exceeding $50 billion. However, soybean production in major growing regions faces an increasingly critical challenge: water scarcity coupled with climate variability. Between 2012 and 2023, severe drought affected major soybean-producing regions, resulting in documented yield losses of 10-30% in affected areas. Climate projections derived from the Coupled Model Intercomparison Project (CMIP5) indicate that water stress will intensify in major agricultural regions, particularly in the Great Plains and Western Corn Belt.</w:t>
+      </w:r>
+    </w:p>
+    <w:p>
+      <w:r>
+        <w:t>Currently, only approximately 15% of United States soybean acreage is irrigated, with irrigation concentrated primarily in the Western Great Plains and Mid-South regions. The majority of soybean production depends on rainfed agriculture, leaving farmers vulnerable to drought conditions. In irrigated regions, full-season irrigation applying 250-300 mm of water annually remains the standard management practice, despite evidence that soils cannot retain all applied water for crop use.</w:t>
       </w:r>
     </w:p>
     <w:p>
@@ -58,12 +59,17 @@
         <w:pStyle w:val="Heading2"/>
       </w:pPr>
       <w:r>
-        <w:t>B. Proposed Solution: Deficit Irrigation</w:t>
+        <w:t>B. Knowledge Gap and Research Need</w:t>
       </w:r>
     </w:p>
     <w:p>
       <w:r>
-        <w:t>Strategic water application &lt;100% crop requirement, maintaining productivity while conserving water. Benefits: increased water use efficiency, extended irrigation capacity, reduced costs, enhanced sustainability, climate resilience.</w:t>
+        <w:t>Deficit irrigation—the strategic application of water quantities less than full crop requirement while minimizing yield loss—offers a transformative opportunity to enhance both productivity and sustainability of soybean production. This approach has demonstrated success in cotton, wheat, and corn, achieving water savings of 30-50% with yield reductions of only 5-20%. However, a critical knowledge gap exists for soybeans: comprehensive field research on soybean deficit irrigation response across United States growing regions is limited, regionally concentrated, and rarely integrated with process-based predictive models.</w:t>
+      </w:r>
+    </w:p>
+    <w:p>
+      <w:r>
+        <w:t>Farmers and extension professionals currently lack: (1) region-specific guidance on optimal deficit irrigation strategies; (2) predictive tools to estimate yield-water tradeoffs under variable climatic conditions; (3) evidence-based decision frameworks for implementing deficit irrigation with confidence; and (4) mechanistic understanding of the physiological processes limiting soybean production under water deficit stress.</w:t>
       </w:r>
     </w:p>
     <w:p>
@@ -71,25 +77,12 @@
         <w:pStyle w:val="Heading2"/>
       </w:pPr>
       <w:r>
-        <w:t>C. Research Gap</w:t>
+        <w:t>C. Proposed Innovation</w:t>
       </w:r>
     </w:p>
     <w:p>
       <w:r>
-        <w:t>Despite success in other crops (cotton, wheat, corn), soybean deficit irrigation lacks: (1) multi-region US data; (2) mechanistic understanding; (3) predictive models; (4) farmer decision tools.</w:t>
-      </w:r>
-    </w:p>
-    <w:p>
-      <w:pPr>
-        <w:pStyle w:val="Heading2"/>
-      </w:pPr>
-      <w:r>
-        <w:t>D. Innovation and Approach</w:t>
-      </w:r>
-    </w:p>
-    <w:p>
-      <w:r>
-        <w:t>Integrated field-modeling approach: multi-location field experiments + process-based model development + practical decision tools + regional assessment. Novel for soybean, urgent given climate change and water constraints.</w:t>
+        <w:t>This proposal implements an integrated field-modeling approach combining: (1) multi-location field experiments documenting yield and physiological responses across irrigation levels; (2) process-based model improvements grounded in mechanistic understanding of water stress; (3) practical decision support tools enabling farmer adoption; and (4) regional vulnerability assessments guiding investment priorities. This approach is novel for soybean in the United States context and responds urgently to climate change and water sustainability challenges.</w:t>
       </w:r>
     </w:p>
     <w:p>
@@ -105,22 +98,17 @@
         <w:pStyle w:val="Heading2"/>
       </w:pPr>
       <w:r>
-        <w:t>A. Current Knowledge Base</w:t>
+        <w:t>A. Soybean Water Requirements and Growth Stage Sensitivity</w:t>
       </w:r>
     </w:p>
     <w:p>
       <w:r>
-        <w:t>Soybean water requirements: 400-600 mm/season (precipitation + irrigation)</w:t>
+        <w:t>Soybean is classified as a moderately water-demanding crop requiring 400-600 mm of water (precipitation plus irrigation) annually for optimal growth, with substantial variation depending on region, cultivar, and growing season weather patterns. Water availability is most critical during specific developmental stages: the reproductive phases from flowering (R1) through seed filling (R5), typically occurring during July-August in northern United States production regions. Water stress during these critical stages directly determines seed number and weight, the primary yield components determining final grain yield.</w:t>
       </w:r>
     </w:p>
     <w:p>
       <w:r>
-        <w:t>Most sensitive stages: R1-R5 (flowering to pod fill, July-August)</w:t>
-      </w:r>
-    </w:p>
-    <w:p>
-      <w:r>
-        <w:t>Published deficit irrigation research: Limited, regionally concentrated, rarely integrated with models</w:t>
+        <w:t>In contrast, vegetative growth stages (V1-V10) demonstrate greater tolerance to moderate water deficits. Research indicates that soybeans can withstand 50% of available water deficit during vegetative stages with minimal yield impact, while similar stress during reproductive stages causes proportionally greater yield loss. This differential sensitivity across growth stages provides the physiological foundation for regulated deficit irrigation strategies.</w:t>
       </w:r>
     </w:p>
     <w:p>
@@ -128,27 +116,17 @@
         <w:pStyle w:val="Heading2"/>
       </w:pPr>
       <w:r>
-        <w:t>B. Knowledge Gaps</w:t>
+        <w:t>B. Success of Deficit Irrigation in Related Crops</w:t>
       </w:r>
     </w:p>
     <w:p>
       <w:r>
-        <w:t>1. Regional specificity: Most data from Australia/Brazil, limited multi-region US evidence</w:t>
+        <w:t>Cotton production in western United States demonstrates that deficit irrigation achieves 30-50% water savings with less than 10% yield reduction through strategic timing of water application. Wheat production in water-limited regions achieves similar water conservation with variable yield responses depending on growth stage timing of stress. Corn/maize production shows that regulated deficit irrigation during non-critical periods can maintain yields near full-irrigation levels while reducing water applications by 30-40%.</w:t>
       </w:r>
     </w:p>
     <w:p>
       <w:r>
-        <w:t>2. Physiological mechanisms: Limited understanding of water stress effects on yield components</w:t>
-      </w:r>
-    </w:p>
-    <w:p>
-      <w:r>
-        <w:t>3. Model representation: Existing models inadequately represent soybean stress response</w:t>
-      </w:r>
-    </w:p>
-    <w:p>
-      <w:r>
-        <w:t>4. Decision framework: No published farmer-ready tools for soybean deficit irrigation planning</w:t>
+        <w:t>These successes in related crops establish proof-of-concept for deficit irrigation as a viable strategy. However, soybean demonstrates indeterminate flowering patterns, smaller seed size, and different physiological responses to water stress, suggesting that deficit irrigation strategies optimized for other crops may not directly transfer to soybean without region-specific research and validation.</w:t>
       </w:r>
     </w:p>
     <w:p>
@@ -156,7 +134,7 @@
         <w:pStyle w:val="Heading2"/>
       </w:pPr>
       <w:r>
-        <w:t>C. Why This Matters</w:t>
+        <w:t>C. Research Gaps Addressed by This Proposal</w:t>
       </w:r>
     </w:p>
     <w:p>
@@ -164,7 +142,7 @@
         <w:pStyle w:val="ListBullet"/>
       </w:pPr>
       <w:r>
-        <w:t>• Addresses critical gap: First comprehensive field-modeling integration for US soybean deficit irrigation</w:t>
+        <w:t>1. Regional Specificity: Published soybean deficit irrigation research is concentrated in Australia, Brazil, and limited United States locations. Comprehensive multi-site United States field data across major soybean-producing regions are lacking.</w:t>
       </w:r>
     </w:p>
     <w:p>
@@ -172,7 +150,7 @@
         <w:pStyle w:val="ListBullet"/>
       </w:pPr>
       <w:r>
-        <w:t>• Timely: Climate change increasing drought frequency and severity</w:t>
+        <w:t>2. Physiological Mechanisms: Limited understanding exists regarding which physiological processes (photosynthesis, assimilate partitioning, reproductive development) are most affected by water deficit in soybean.</w:t>
       </w:r>
     </w:p>
     <w:p>
@@ -180,7 +158,7 @@
         <w:pStyle w:val="ListBullet"/>
       </w:pPr>
       <w:r>
-        <w:t>• Broad impact: 87M acres US soybean production; small efficiency gains = massive water savings</w:t>
+        <w:t>3. Predictive Modeling: Existing process-based models (DSSAT, RZWQM2, AquaCrop) inadequately represent soybean physiological response to water deficit, limiting their utility for deficit irrigation planning.</w:t>
       </w:r>
     </w:p>
     <w:p>
@@ -188,15 +166,7 @@
         <w:pStyle w:val="ListBullet"/>
       </w:pPr>
       <w:r>
-        <w:t>• Economic: Water = increasingly constraining input; farmers need profitable alternatives</w:t>
-      </w:r>
-    </w:p>
-    <w:p>
-      <w:pPr>
-        <w:pStyle w:val="ListBullet"/>
-      </w:pPr>
-      <w:r>
-        <w:t>• Environmental: Groundwater depletion unsustainable; deficit irrigation essential for sustainability</w:t>
+        <w:t>4. Farmer Decision Framework: No production-ready, farmer-accessible tools exist for planning deficit irrigation in soybean based on regional conditions and farm-specific circumstances.</w:t>
       </w:r>
     </w:p>
     <w:p>
@@ -217,47 +187,22 @@
     </w:p>
     <w:p>
       <w:r>
-        <w:t>Multi-location, multi-year field studies across 5 US regions:</w:t>
+        <w:t>Goal: Establish multi-location, multi-year field experiments documenting soybean yield, water use efficiency, and physiological responses across irrigation levels.</w:t>
       </w:r>
     </w:p>
     <w:p>
-      <w:pPr>
-        <w:pStyle w:val="ListBullet"/>
-      </w:pPr>
       <w:r>
-        <w:t>Sites: Nebraska (Central), Iowa (Eastern), Illinois (Central), Arkansas (Eastern), Minnesota (Southern)</w:t>
+        <w:t>Multi-location field studies will be conducted across five representative United States soybean-growing regions: Nebraska (Central), Iowa (Eastern), Illinois (Central), Arkansas (Eastern), and Minnesota (Southern). These sites represent the geographic diversity of soybean production and water availability conditions. Each site will be managed for three consecutive growing seasons (2027-2029), providing data across variable rainfall years and enabling robust characterization of yield-water relationships.</w:t>
       </w:r>
     </w:p>
     <w:p>
-      <w:pPr>
-        <w:pStyle w:val="ListBullet"/>
-      </w:pPr>
       <w:r>
-        <w:t>Duration: 3 years per site, RCBD design, 3-4 replicates</w:t>
+        <w:t>Experimental design will employ a Randomized Complete Block Design (RCBD) with 3-4 replicates per site. Four irrigation treatment levels will represent different deficit strategies: Full Irrigation (FI) applying 250 mm supplemental water; Regulated Deficit Irrigation 50% (RDI-50%) applying 125 mm; Regulated Deficit Irrigation 25% (RDI-25%) applying 63 mm; and Rainfed baseline applying 0 mm supplemental irrigation.</w:t>
       </w:r>
     </w:p>
     <w:p>
-      <w:pPr>
-        <w:pStyle w:val="ListBullet"/>
-      </w:pPr>
       <w:r>
-        <w:t>Treatments: FI (250mm), RDI-50% (125mm), RDI-25% (63mm), Rainfed (0mm)</w:t>
-      </w:r>
-    </w:p>
-    <w:p>
-      <w:pPr>
-        <w:pStyle w:val="ListBullet"/>
-      </w:pPr>
-      <w:r>
-        <w:t>Measurements: Yield, WUE, soil moisture, plant water status, physiological parameters</w:t>
-      </w:r>
-    </w:p>
-    <w:p>
-      <w:pPr>
-        <w:pStyle w:val="ListBullet"/>
-      </w:pPr>
-      <w:r>
-        <w:t>Output: Region-specific yield-water response curves, field validation dataset</w:t>
+        <w:t>Measurements will include: grain yield (kg/ha), water use efficiency (kg grain per mm water), seed number and weight, soil volumetric water content (0-60 cm profile), plant water potential (pre-dawn and midday), stomatal conductance, net photosynthesis, leaf chlorophyll content (SPAD), plant biomass accumulation at key growth stages (R1, R3, R5), and phenological observations (flowering date, physiological maturity). Soil moisture will be monitored continuously with automated sensors, and evapotranspiration will be calculated via water balance methods.</w:t>
       </w:r>
     </w:p>
     <w:p>
@@ -265,531 +210,27 @@
         <w:pStyle w:val="Heading2"/>
       </w:pPr>
       <w:r>
-        <w:t>Objective 2: Model Improvement - Soil-Water Dynamics</w:t>
+        <w:t>Objective 2: Soil-Water Dynamics Model Improvement</w:t>
       </w:r>
     </w:p>
     <w:p>
       <w:r>
-        <w:t>Enhance soil-water module of process-based model (RZWQM2):</w:t>
-      </w:r>
-    </w:p>
-    <w:p>
-      <w:pPr>
-        <w:pStyle w:val="ListBullet"/>
-      </w:pPr>
-      <w:r>
-        <w:t>Improve water retention curves (van Genuchten parameterization)</w:t>
-      </w:r>
-    </w:p>
-    <w:p>
-      <w:pPr>
-        <w:pStyle w:val="ListBullet"/>
-      </w:pPr>
-      <w:r>
-        <w:t>Add macropore flow representation for clay soils</w:t>
-      </w:r>
-    </w:p>
-    <w:p>
-      <w:pPr>
-        <w:pStyle w:val="ListBullet"/>
-      </w:pPr>
-      <w:r>
-        <w:t>Develop dynamic root distribution and water uptake functions</w:t>
-      </w:r>
-    </w:p>
-    <w:p>
-      <w:pPr>
-        <w:pStyle w:val="ListBullet"/>
-      </w:pPr>
-      <w:r>
-        <w:t>Validate with field data from Objective 1</w:t>
-      </w:r>
-    </w:p>
-    <w:p>
-      <w:pPr>
-        <w:pStyle w:val="ListBullet"/>
-      </w:pPr>
-      <w:r>
-        <w:t>Output: Improved model module with improved accuracy</w:t>
-      </w:r>
-    </w:p>
-    <w:p>
-      <w:pPr>
-        <w:pStyle w:val="Heading2"/>
-      </w:pPr>
-      <w:r>
-        <w:t>Objective 3: Model Improvement - Crop Physiology</w:t>
+        <w:t>Goal: Enhance process-based model representation of soil water availability, water movement, and plant-available water dynamics under deficit irrigation conditions.</w:t>
       </w:r>
     </w:p>
     <w:p>
       <w:r>
-        <w:t>Develop mechanistic soybean physiological response to water stress:</w:t>
-      </w:r>
-    </w:p>
-    <w:p>
-      <w:pPr>
-        <w:pStyle w:val="ListBullet"/>
-      </w:pPr>
-      <w:r>
-        <w:t>Develop normalized water stress index (soil + plant + atmosphere factors)</w:t>
-      </w:r>
-    </w:p>
-    <w:p>
-      <w:pPr>
-        <w:pStyle w:val="ListBullet"/>
-      </w:pPr>
-      <w:r>
-        <w:t>Implement water stress functions for stomatal conductance and photosynthesis</w:t>
-      </w:r>
-    </w:p>
-    <w:p>
-      <w:pPr>
-        <w:pStyle w:val="ListBullet"/>
-      </w:pPr>
-      <w:r>
-        <w:t>Model reproductive organ sensitivity to deficit stress</w:t>
-      </w:r>
-    </w:p>
-    <w:p>
-      <w:pPr>
-        <w:pStyle w:val="ListBullet"/>
-      </w:pPr>
-      <w:r>
-        <w:t>Link to assimilate partitioning and yield components</w:t>
-      </w:r>
-    </w:p>
-    <w:p>
-      <w:pPr>
-        <w:pStyle w:val="ListBullet"/>
-      </w:pPr>
-      <w:r>
-        <w:t>Parameterize with field gas exchange and yield data</w:t>
-      </w:r>
-    </w:p>
-    <w:p>
-      <w:pPr>
-        <w:pStyle w:val="ListBullet"/>
-      </w:pPr>
-      <w:r>
-        <w:t>Output: Physics-based model of soybean water stress response</w:t>
-      </w:r>
-    </w:p>
-    <w:p>
-      <w:pPr>
-        <w:pStyle w:val="Heading2"/>
-      </w:pPr>
-      <w:r>
-        <w:t>Objective 4: Model Application - Scenario Analysis &amp; Decision Tools</w:t>
+        <w:t>The RZWQM2 (Root Zone Water Quality Management) model will serve as the platform for model improvement, selected for its mechanistic representation of soil-water physics and established soybean crop module. Current model limitations include simplified water retention characterization, inadequate representation of macropore flow in clay-textured soils, and static root distribution assumptions that do not adjust to water availability.</w:t>
       </w:r>
     </w:p>
     <w:p>
       <w:r>
-        <w:t>Use improved models for climate/management scenarios and farmer decision support:</w:t>
-      </w:r>
-    </w:p>
-    <w:p>
-      <w:pPr>
-        <w:pStyle w:val="ListBullet"/>
-      </w:pPr>
-      <w:r>
-        <w:t>Climate projections: CMIP5 ensemble (2040-2070 vs 1980-2015)</w:t>
-      </w:r>
-    </w:p>
-    <w:p>
-      <w:pPr>
-        <w:pStyle w:val="ListBullet"/>
-      </w:pPr>
-      <w:r>
-        <w:t>Management scenarios: Irrigation levels × timing × cultivars × soil types</w:t>
-      </w:r>
-    </w:p>
-    <w:p>
-      <w:pPr>
-        <w:pStyle w:val="ListBullet"/>
-      </w:pPr>
-      <w:r>
-        <w:t>Decision tools: Web calculator, mobile app, spreadsheet templates</w:t>
-      </w:r>
-    </w:p>
-    <w:p>
-      <w:pPr>
-        <w:pStyle w:val="ListBullet"/>
-      </w:pPr>
-      <w:r>
-        <w:t>Validation: Test against independent field data; farmer focus group feedback</w:t>
-      </w:r>
-    </w:p>
-    <w:p>
-      <w:pPr>
-        <w:pStyle w:val="ListBullet"/>
-      </w:pPr>
-      <w:r>
-        <w:t>Output: Production-ready decision support system</w:t>
-      </w:r>
-    </w:p>
-    <w:p>
-      <w:pPr>
-        <w:pStyle w:val="Heading2"/>
-      </w:pPr>
-      <w:r>
-        <w:t>Objective 5: Regional Vulnerability Assessment</w:t>
+        <w:t>Model improvements will include: (1) implementation of van Genuchten water retention functions parameterized with soil samples from each study site; (2) dual-porosity macropore flow representation for clay soils experiencing structural cracks and preferential flow pathways; (3) dynamic root distribution functions responding to soil water availability; and (4) physically-based water stress reduction functions linking plant water potential to root water uptake rate.</w:t>
       </w:r>
     </w:p>
     <w:p>
       <w:r>
-        <w:t>Assess soybean production vulnerability and adaptation options:</w:t>
-      </w:r>
-    </w:p>
-    <w:p>
-      <w:pPr>
-        <w:pStyle w:val="ListBullet"/>
-      </w:pPr>
-      <w:r>
-        <w:t>Develop vulnerability index (water stress + production volume + groundwater status)</w:t>
-      </w:r>
-    </w:p>
-    <w:p>
-      <w:pPr>
-        <w:pStyle w:val="ListBullet"/>
-      </w:pPr>
-      <w:r>
-        <w:t>Regional analysis: Apply to major soybean-producing regions</w:t>
-      </w:r>
-    </w:p>
-    <w:p>
-      <w:pPr>
-        <w:pStyle w:val="ListBullet"/>
-      </w:pPr>
-      <w:r>
-        <w:t>Estimate deficit irrigation adoption potential and water savings</w:t>
-      </w:r>
-    </w:p>
-    <w:p>
-      <w:pPr>
-        <w:pStyle w:val="ListBullet"/>
-      </w:pPr>
-      <w:r>
-        <w:t>Create vulnerability maps for current and future climates</w:t>
-      </w:r>
-    </w:p>
-    <w:p>
-      <w:pPr>
-        <w:pStyle w:val="ListBullet"/>
-      </w:pPr>
-      <w:r>
-        <w:t>Output: Regional assessment guiding policy and investment priorities</w:t>
-      </w:r>
-    </w:p>
-    <w:p>
-      <w:pPr>
-        <w:pStyle w:val="Heading2"/>
-      </w:pPr>
-      <w:r>
-        <w:t>Objective 6: Policy Analysis and Adoption Strategy</w:t>
-      </w:r>
-    </w:p>
-    <w:p>
-      <w:r>
-        <w:t>Examine adoption barriers and economic viability:</w:t>
-      </w:r>
-    </w:p>
-    <w:p>
-      <w:pPr>
-        <w:pStyle w:val="ListBullet"/>
-      </w:pPr>
-      <w:r>
-        <w:t>Cost-benefit analysis: Irrigation system costs vs water/energy savings</w:t>
-      </w:r>
-    </w:p>
-    <w:p>
-      <w:pPr>
-        <w:pStyle w:val="ListBullet"/>
-      </w:pPr>
-      <w:r>
-        <w:t>Adoption barrier survey: 50-75 farmers identify knowledge, economic, institutional barriers</w:t>
-      </w:r>
-    </w:p>
-    <w:p>
-      <w:pPr>
-        <w:pStyle w:val="ListBullet"/>
-      </w:pPr>
-      <w:r>
-        <w:t>Policy review: Existing incentive programs; identify gaps</w:t>
-      </w:r>
-    </w:p>
-    <w:p>
-      <w:pPr>
-        <w:pStyle w:val="ListBullet"/>
-      </w:pPr>
-      <w:r>
-        <w:t>Stakeholder engagement: Present findings to farmers, extension, policymakers</w:t>
-      </w:r>
-    </w:p>
-    <w:p>
-      <w:pPr>
-        <w:pStyle w:val="ListBullet"/>
-      </w:pPr>
-      <w:r>
-        <w:t>Output: Policy recommendations and farmer adoption strategies</w:t>
-      </w:r>
-    </w:p>
-    <w:p>
-      <w:pPr>
-        <w:pStyle w:val="Heading1"/>
-      </w:pPr>
-      <w:r>
-        <w:t>IV. EXPECTED OUTCOMES</w:t>
-      </w:r>
-    </w:p>
-    <w:p>
-      <w:pPr>
-        <w:pStyle w:val="Heading2"/>
-      </w:pPr>
-      <w:r>
-        <w:t>Scientific Publications (6-7 total)</w:t>
-      </w:r>
-    </w:p>
-    <w:p>
-      <w:pPr>
-        <w:pStyle w:val="ListBullet"/>
-      </w:pPr>
-      <w:r>
-        <w:t>Soybean yield-water response curves across US regions</w:t>
-      </w:r>
-    </w:p>
-    <w:p>
-      <w:pPr>
-        <w:pStyle w:val="ListBullet"/>
-      </w:pPr>
-      <w:r>
-        <w:t>Physiological mechanisms of water stress (1-2 papers)</w:t>
-      </w:r>
-    </w:p>
-    <w:p>
-      <w:pPr>
-        <w:pStyle w:val="ListBullet"/>
-      </w:pPr>
-      <w:r>
-        <w:t>Model development and validation (2 papers)</w:t>
-      </w:r>
-    </w:p>
-    <w:p>
-      <w:pPr>
-        <w:pStyle w:val="ListBullet"/>
-      </w:pPr>
-      <w:r>
-        <w:t>Regional vulnerability and adaptation strategies</w:t>
-      </w:r>
-    </w:p>
-    <w:p>
-      <w:pPr>
-        <w:pStyle w:val="ListBullet"/>
-      </w:pPr>
-      <w:r>
-        <w:t>Policy analysis of adoption barriers and incentives</w:t>
-      </w:r>
-    </w:p>
-    <w:p>
-      <w:pPr>
-        <w:pStyle w:val="Heading2"/>
-      </w:pPr>
-      <w:r>
-        <w:t>Decision Support Tools and Resources</w:t>
-      </w:r>
-    </w:p>
-    <w:p>
-      <w:pPr>
-        <w:pStyle w:val="ListBullet"/>
-      </w:pPr>
-      <w:r>
-        <w:t>Web-based deficit irrigation calculator</w:t>
-      </w:r>
-    </w:p>
-    <w:p>
-      <w:pPr>
-        <w:pStyle w:val="ListBullet"/>
-      </w:pPr>
-      <w:r>
-        <w:t>Mobile app for on-farm decision support</w:t>
-      </w:r>
-    </w:p>
-    <w:p>
-      <w:pPr>
-        <w:pStyle w:val="ListBullet"/>
-      </w:pPr>
-      <w:r>
-        <w:t>Spreadsheet templates and planning tools</w:t>
-      </w:r>
-    </w:p>
-    <w:p>
-      <w:pPr>
-        <w:pStyle w:val="ListBullet"/>
-      </w:pPr>
-      <w:r>
-        <w:t>Extension publication series (3-4 regional bulletins)</w:t>
-      </w:r>
-    </w:p>
-    <w:p>
-      <w:pPr>
-        <w:pStyle w:val="ListBullet"/>
-      </w:pPr>
-      <w:r>
-        <w:t>Open-source model code (GitHub)</w:t>
-      </w:r>
-    </w:p>
-    <w:p>
-      <w:pPr>
-        <w:pStyle w:val="Heading2"/>
-      </w:pPr>
-      <w:r>
-        <w:t>Training and Capacity Building</w:t>
-      </w:r>
-    </w:p>
-    <w:p>
-      <w:pPr>
-        <w:pStyle w:val="ListBullet"/>
-      </w:pPr>
-      <w:r>
-        <w:t>Graduate students: 3-4 trained in agricultural water management</w:t>
-      </w:r>
-    </w:p>
-    <w:p>
-      <w:pPr>
-        <w:pStyle w:val="ListBullet"/>
-      </w:pPr>
-      <w:r>
-        <w:t>Extension educators: Workshops for 50-100+ professionals</w:t>
-      </w:r>
-    </w:p>
-    <w:p>
-      <w:pPr>
-        <w:pStyle w:val="ListBullet"/>
-      </w:pPr>
-      <w:r>
-        <w:t>Farmer field days: On-farm demonstrations (50-200 farmers/site/year)</w:t>
-      </w:r>
-    </w:p>
-    <w:p>
-      <w:pPr>
-        <w:pStyle w:val="ListBullet"/>
-      </w:pPr>
-      <w:r>
-        <w:t>Online short course on deficit irrigation management</w:t>
-      </w:r>
-    </w:p>
-    <w:p>
-      <w:pPr>
-        <w:pStyle w:val="Heading2"/>
-      </w:pPr>
-      <w:r>
-        <w:t>Data and Resources</w:t>
-      </w:r>
-    </w:p>
-    <w:p>
-      <w:pPr>
-        <w:pStyle w:val="ListBullet"/>
-      </w:pPr>
-      <w:r>
-        <w:t>Multi-site, multi-year field dataset (open access)</w:t>
-      </w:r>
-    </w:p>
-    <w:p>
-      <w:pPr>
-        <w:pStyle w:val="ListBullet"/>
-      </w:pPr>
-      <w:r>
-        <w:t>Improved model code on GitHub</w:t>
-      </w:r>
-    </w:p>
-    <w:p>
-      <w:pPr>
-        <w:pStyle w:val="ListBullet"/>
-      </w:pPr>
-      <w:r>
-        <w:t>Downscaled climate scenario data</w:t>
-      </w:r>
-    </w:p>
-    <w:p>
-      <w:pPr>
-        <w:pStyle w:val="Heading1"/>
-      </w:pPr>
-      <w:r>
-        <w:t>V. LONG-TERM IMPACT VISION</w:t>
-      </w:r>
-    </w:p>
-    <w:p>
-      <w:r>
-        <w:t>Years 1-3 (Research): Field experiments, model development, initial tools</w:t>
-      </w:r>
-    </w:p>
-    <w:p>
-      <w:r>
-        <w:t>Years 3-5 (Adoption): Farmer adoption, on-farm validation, documented outcomes</w:t>
-      </w:r>
-    </w:p>
-    <w:p>
-      <w:r>
-        <w:t>Years 5+ (Scaling): Widespread adoption, 100s millions gallons/year water savings, integration into USDA/state programs</w:t>
-      </w:r>
-    </w:p>
-    <w:p>
-      <w:pPr>
-        <w:pStyle w:val="Heading1"/>
-      </w:pPr>
-      <w:r>
-        <w:t>VI. ALIGNMENT WITH USB/COMMODITY BOARD PRIORITIES</w:t>
-      </w:r>
-    </w:p>
-    <w:p>
-      <w:pPr>
-        <w:pStyle w:val="Heading2"/>
-      </w:pPr>
-      <w:r>
-        <w:t>Farmer Productivity and Profitability</w:t>
-      </w:r>
-    </w:p>
-    <w:p>
-      <w:r>
-        <w:t>Maintains/increases yields while reducing water costs ($50-150/acre savings possible)</w:t>
-      </w:r>
-    </w:p>
-    <w:p>
-      <w:pPr>
-        <w:pStyle w:val="Heading2"/>
-      </w:pPr>
-      <w:r>
-        <w:t>Water Stewardship and Sustainability</w:t>
-      </w:r>
-    </w:p>
-    <w:p>
-      <w:r>
-        <w:t>Addresses groundwater depletion crisis; enables long-term sustainable irrigation</w:t>
-      </w:r>
-    </w:p>
-    <w:p>
-      <w:pPr>
-        <w:pStyle w:val="Heading2"/>
-      </w:pPr>
-      <w:r>
-        <w:t>Research-to-Adoption Pipeline</w:t>
-      </w:r>
-    </w:p>
-    <w:p>
-      <w:r>
-        <w:t>Field research + farmer advisory + on-farm validation + extension partnership = rapid adoption</w:t>
-      </w:r>
-    </w:p>
-    <w:p>
-      <w:pPr>
-        <w:pStyle w:val="Heading2"/>
-      </w:pPr>
-      <w:r>
-        <w:t>Climate Readiness</w:t>
-      </w:r>
-    </w:p>
-    <w:p>
-      <w:r>
-        <w:t>Adaptive management strategies for increasing drought frequency and water stress</w:t>
+        <w:t>Model validation will employ field measurements from Objective 1, comparing predicted soil moisture profiles against observed data using multiple goodness-of-fit metrics (RMSE, Nash-Sutcliffe Efficiency, Percent Bias). Sensitivity analysis will identify model parameters with greatest influence on yield predictions, focusing parameterization efforts on high-sensitivity components.</w:t>
       </w:r>
     </w:p>
     <w:sectPr>

</xml_diff>

<commit_message>
Remove all climate change related work - focus on drought and water management
PROPOSAL_OUTLINE.docx changes:
- Removed 'climate variability' from opening sentence
- Removed 'climate change projections' references
- Removed 'climate-resilient production systems' from impact statement
- Kept all drought-related content (water scarcity, drought episodes, yield losses)
- Kept water sustainability and resource conservation focus

LITERATURE_SEARCH_RESULTS.md changes:
- Removed 'Climate Change & Drought Projections' section
- Removed Hatfield et al. (2018) - Climate Projections paper
- Removed Siebert et al. (2015) - Climate Change Vulnerability paper
- Renumbered papers 8-10 to remove climate papers
- Updated access table to reflect 10 papers (down from 12)

Focus now strictly on:
- Deficit irrigation strategies
- Water stress physiology
- Drought impacts on yield
- Water use efficiency
- Irrigation management & farmer decision-making
- Water sustainability (not climate change)
</commit_message>
<xml_diff>
--- a/proposal/PROPOSAL_OUTLINE.docx
+++ b/proposal/PROPOSAL_OUTLINE.docx
@@ -20,7 +20,7 @@
     </w:p>
     <w:p>
       <w:r>
-        <w:t>Soybean (Glycine max) production in the United States occupies 87.5 million acres annually and generates over $50 billion in economic value, yet production faces an escalating paradox: while only 15% of soybean acreage is irrigated, water scarcity and climate variability increasingly threaten yields in both irrigated and rainfed systems, with recent drought episodes (2012-2023) causing yield losses of 10-30% across major production regions.</w:t>
+        <w:t>Soybean (Glycine max) production in the United States occupies 87.5 million acres annually and generates over $50 billion in economic value, yet production faces an escalating challenge: water scarcity threatens yields in both irrigated and rainfed systems, with recent drought episodes (2012-2023) causing yield losses of 10-30% across major production regions.</w:t>
       </w:r>
     </w:p>
     <w:p>
@@ -30,9 +30,6 @@
     </w:p>
     <w:p>
       <w:r>
-        <w:rPr>
-          <w:sz w:val="22"/>
-        </w:rPr>
         <w:t xml:space="preserve">While these crop studies have provided evidence that deficit irrigation can reduce water applications without proportional yield losses, a critical knowledge gap persists for soybean: </w:t>
       </w:r>
       <w:r>
@@ -61,7 +58,7 @@
     </w:p>
     <w:p>
       <w:r>
-        <w:t>Without this knowledge, the substantial economic losses from drought-induced soybean yield reductions will persist, groundwater depletion in irrigated regions will accelerate, agricultural water sustainability will remain compromised, and opportunities to align soybean production with the USDA's strategic priorities for water stewardship and agricultural resilience will be missed.</w:t>
+        <w:t>Without this knowledge, the substantial economic losses from drought-induced soybean yield reductions will persist, groundwater depletion in irrigated regions will accelerate, and agricultural water sustainability will remain compromised.</w:t>
       </w:r>
     </w:p>
     <w:p/>
@@ -211,7 +208,7 @@
     </w:p>
     <w:p>
       <w:r>
-        <w:t>By establishing physiologically-grounded deficit irrigation strategies and providing farmers with evidence-based decision tools, these outcomes are anticipated to enable adoption of water conservation practices by 25-50% of soybean producers in water-limited regions, achieving significant reductions in agricultural water consumption while maintaining or increasing economic productivity and advancing USDA strategic priorities for agricultural sustainability and climate-resilient production.</w:t>
+        <w:t>By establishing physiologically-grounded deficit irrigation strategies and providing farmers with evidence-based decision tools, these outcomes are anticipated to enable adoption of water conservation practices by 25-50% of soybean producers in water-limited regions, achieving significant reductions in agricultural water consumption while maintaining or increasing economic productivity and advancing USDA strategic priorities for agricultural sustainability and water stewardship.</w:t>
       </w:r>
     </w:p>
     <w:sectPr>

</xml_diff>